<commit_message>
falta ajustes de exportacion de informacion de la base a las plantillas
</commit_message>
<xml_diff>
--- a/Formatos_Cruce/ACTIVAR FACTURA VIRTUAL (1).docx
+++ b/Formatos_Cruce/ACTIVAR FACTURA VIRTUAL (1).docx
@@ -207,8 +207,6 @@
         </w:rPr>
         <w:t>_radicado</w:t>
       </w:r>
-      <w:bookmarkStart w:id="0" w:name="_GoBack"/>
-      <w:bookmarkEnd w:id="0"/>
       <w:r>
         <w:rPr>
           <w:rFonts w:ascii="Arial" w:eastAsia="Calibri" w:hAnsi="Arial" w:cs="Arial"/>
@@ -224,7 +222,7 @@
           <w:lang w:val="es-CO" w:eastAsia="en-US"/>
         </w:rPr>
       </w:pPr>
-      <w:bookmarkStart w:id="1" w:name="_Hlk224806971"/>
+      <w:bookmarkStart w:id="0" w:name="_Hlk224806971"/>
       <w:r>
         <w:rPr>
           <w:rFonts w:ascii="Arial" w:eastAsia="Calibri" w:hAnsi="Arial" w:cs="Arial"/>
@@ -249,7 +247,7 @@
         <w:t>}}</w:t>
       </w:r>
     </w:p>
-    <w:bookmarkEnd w:id="1"/>
+    <w:bookmarkEnd w:id="0"/>
     <w:p>
       <w:pPr>
         <w:rPr>
@@ -386,7 +384,7 @@
           <w:noProof/>
           <w:lang w:val="es-CO" w:eastAsia="en-US"/>
         </w:rPr>
-        <w:t>ENTRADA</w:t>
+        <w:t>entrada</w:t>
       </w:r>
       <w:r>
         <w:rPr>
@@ -445,30 +443,16 @@
         </w:rPr>
         <w:fldChar w:fldCharType="separate"/>
       </w:r>
+      <w:bookmarkStart w:id="1" w:name="_GoBack"/>
       <w:r>
         <w:rPr>
           <w:rFonts w:ascii="Arial" w:eastAsia="Calibri" w:hAnsi="Arial" w:cs="Arial"/>
           <w:noProof/>
           <w:lang w:val="es-CO" w:eastAsia="en-US"/>
         </w:rPr>
-        <w:t>{{</w:t>
-      </w:r>
-      <w:r>
-        <w:rPr>
-          <w:rFonts w:ascii="Arial" w:eastAsia="Calibri" w:hAnsi="Arial" w:cs="Arial"/>
-          <w:noProof/>
-          <w:lang w:val="es-CO" w:eastAsia="en-US"/>
-        </w:rPr>
-        <w:t>fecha_de_radicado</w:t>
-      </w:r>
-      <w:r>
-        <w:rPr>
-          <w:rFonts w:ascii="Arial" w:eastAsia="Calibri" w:hAnsi="Arial" w:cs="Arial"/>
-          <w:noProof/>
-          <w:lang w:val="es-CO" w:eastAsia="en-US"/>
-        </w:rPr>
-        <w:t>}}</w:t>
-      </w:r>
+        <w:t>{{fecha_de_radicado}}</w:t>
+      </w:r>
+      <w:bookmarkEnd w:id="1"/>
       <w:r>
         <w:rPr>
           <w:rFonts w:ascii="Arial" w:eastAsia="Calibri" w:hAnsi="Arial" w:cs="Arial"/>
@@ -834,7 +818,6 @@
         </w:rPr>
         <w:t xml:space="preserve">Reciba un cordial saludo, con el ánimo de brindarle un mejor servicio, queremos informarle que en atención a su comunicación radicada el </w:t>
       </w:r>
-      <w:bookmarkStart w:id="2" w:name="_Hlk224806325"/>
       <w:r>
         <w:rPr>
           <w:rFonts w:ascii="Arial" w:hAnsi="Arial" w:cs="Arial"/>
@@ -855,7 +838,6 @@
         </w:rPr>
         <w:t>}}</w:t>
       </w:r>
-      <w:bookmarkEnd w:id="2"/>
       <w:r>
         <w:rPr>
           <w:rFonts w:ascii="Arial" w:hAnsi="Arial" w:cs="Arial"/>
@@ -2351,14 +2333,14 @@
         <v:path o:extrusionok="f" gradientshapeok="t" o:connecttype="rect"/>
         <o:lock v:ext="edit" aspectratio="t"/>
       </v:shapetype>
-      <v:shape id="_x0000_i1479" type="#_x0000_t75" style="width:66.75pt;height:56.25pt" o:bullet="t">
+      <v:shape id="_x0000_i1028" type="#_x0000_t75" style="width:66.75pt;height:56.25pt" o:bullet="t">
         <v:imagedata r:id="rId1" o:title="Logo_EAAB"/>
       </v:shape>
     </w:pict>
   </w:numPicBullet>
   <w:numPicBullet w:numPicBulletId="1">
     <w:pict>
-      <v:shape id="_x0000_i1480" type="#_x0000_t75" style="width:66.75pt;height:56.25pt" o:bullet="t">
+      <v:shape id="_x0000_i1029" type="#_x0000_t75" style="width:66.75pt;height:56.25pt" o:bullet="t">
         <v:imagedata r:id="rId2" o:title="clip_image001"/>
       </v:shape>
     </w:pict>
@@ -6229,7 +6211,7 @@
 </file>
 
 <file path=customXml/itemProps1.xml><?xml version="1.0" encoding="utf-8"?>
-<ds:datastoreItem xmlns:ds="http://schemas.openxmlformats.org/officeDocument/2006/customXml" ds:itemID="{7B6074A4-DD73-45F3-B82B-43CA29D50953}">
+<ds:datastoreItem xmlns:ds="http://schemas.openxmlformats.org/officeDocument/2006/customXml" ds:itemID="{63230559-141D-4FB7-A22C-10A626330770}">
   <ds:schemaRefs>
     <ds:schemaRef ds:uri="http://schemas.openxmlformats.org/officeDocument/2006/bibliography"/>
   </ds:schemaRefs>

</xml_diff>